<commit_message>
feat: layout 3 columnas para firmas (Comprador | Agente | Propietario)
- DOCX Propuesta y Reserva: tabla 3 columnas sin bordes en sección de firmas
  (antes era una sola línea de texto con los 3 títulos separados por espacios)
- route.js: coordenadas de estampado alineadas con las 3 columnas del PDF
  Col 0 (izquierda): compradores, apilados verticalmente si hay 2
  Col 1 (centro): agente inmobiliario
  Col 2 (derecha): propietario/vendedor

Co-Authored-By: Claude Sonnet 4.6 <noreply@anthropic.com>
Claude-Session: https://claude.ai/code/session_01VwMpxzAmpxxuXHzGz5u6jp
</commit_message>
<xml_diff>
--- a/src/app/api/visitas/documento/2_Propuesta_de_Compra_Oferta.docx
+++ b/src/app/api/visitas/documento/2_Propuesta_de_Compra_Oferta.docx
@@ -591,11 +591,88 @@
         <w:t xml:space="preserve">FIRMAS DE CONFORMIDAD</w:t>
       </w:r>
     </w:p>
-    <w:p>
-      <w:r>
-        <w:t xml:space="preserve">Firma Interesados (Comprador) Firma del Agente Inmobiliario Firma del Propietario</w:t>
-      </w:r>
-    </w:p>
+    <w:tbl>
+      <w:tblPr>
+        <w:tblStyle w:val="TableGrid"/>
+        <w:tblW w:w="8502" w:type="dxa"/>
+        <w:tblBorders>
+          <w:top w:val="none" w:sz="0" w:space="0" w:color="auto"/>
+          <w:left w:val="none" w:sz="0" w:space="0" w:color="auto"/>
+          <w:bottom w:val="none" w:sz="0" w:space="0" w:color="auto"/>
+          <w:right w:val="none" w:sz="0" w:space="0" w:color="auto"/>
+          <w:insideH w:val="none" w:sz="0" w:space="0" w:color="auto"/>
+          <w:insideV w:val="none" w:sz="0" w:space="0" w:color="auto"/>
+        </w:tblBorders>
+        <w:tblCellMar>
+          <w:left w:w="0" w:type="dxa"/>
+          <w:right w:w="0" w:type="dxa"/>
+        </w:tblCellMar>
+      </w:tblPr>
+      <w:tblGrid>
+        <w:gridCol w:w="2834"/>
+        <w:gridCol w:w="2834"/>
+        <w:gridCol w:w="2834"/>
+      </w:tblGrid>
+      <w:tr>
+        <w:tc>
+          <w:tcPr>
+            <w:tcW w:w="2834" w:type="dxa"/>
+          </w:tcPr>
+          <w:p>
+            <w:pPr>
+              <w:spacing w:before="1200" w:after="0"/>
+              <w:jc w:val="center"/>
+            </w:pPr>
+            <w:r>
+              <w:rPr>
+                <w:rFonts w:ascii="Calibri" w:hAnsi="Calibri"/>
+                <w:sz w:val="18"/>
+                <w:color w:val="405C6B"/>
+              </w:rPr>
+              <w:t>Firma Interesados (Comprador)</w:t>
+            </w:r>
+          </w:p>
+        </w:tc>
+        <w:tc>
+          <w:tcPr>
+            <w:tcW w:w="2834" w:type="dxa"/>
+          </w:tcPr>
+          <w:p>
+            <w:pPr>
+              <w:spacing w:before="1200" w:after="0"/>
+              <w:jc w:val="center"/>
+            </w:pPr>
+            <w:r>
+              <w:rPr>
+                <w:rFonts w:ascii="Calibri" w:hAnsi="Calibri"/>
+                <w:sz w:val="18"/>
+                <w:color w:val="405C6B"/>
+              </w:rPr>
+              <w:t>Firma del Agente Inmobiliario</w:t>
+            </w:r>
+          </w:p>
+        </w:tc>
+        <w:tc>
+          <w:tcPr>
+            <w:tcW w:w="2834" w:type="dxa"/>
+          </w:tcPr>
+          <w:p>
+            <w:pPr>
+              <w:spacing w:before="1200" w:after="0"/>
+              <w:jc w:val="center"/>
+            </w:pPr>
+            <w:r>
+              <w:rPr>
+                <w:rFonts w:ascii="Calibri" w:hAnsi="Calibri"/>
+                <w:sz w:val="18"/>
+                <w:color w:val="405C6B"/>
+              </w:rPr>
+              <w:t>Firma del Propietario</w:t>
+            </w:r>
+          </w:p>
+        </w:tc>
+      </w:tr>
+    </w:tbl>
     <w:p>
       <w:pPr>
         <w:spacing w:after="120"/>

</xml_diff>